<commit_message>
Made the changes summary for the Authentication subgroup
</commit_message>
<xml_diff>
--- a/iteration3_deliverables/changes_made_documents/Authentication changes summary.docx
+++ b/iteration3_deliverables/changes_made_documents/Authentication changes summary.docx
@@ -53,7 +53,31 @@
         <w:rPr>
           <w:rFonts w:ascii="Times New Roman" w:hAnsi="Times New Roman" w:cs="Times New Roman"/>
         </w:rPr>
-        <w:t>We also updated the "Change Password" functionality within the homepage. Previously, there was no verification process, but now the system first verifies the registered email and then asks for the old password before allowing the user to set a new one. Another significant update involved the login system. Originally, users logged in using their email address, but now they use their username, which aligns more closely with standard user expectations and makes the interface more intuitive. These improvements not only enhance user security but also improve cross-team compatibility, especially with the Leaderboard and Matchmaking systems, which rely on user ID and username consistency. Diagrammatically, we revised the login and password reset flows to reflect these new steps, making the logic easier to follow and debug.</w:t>
+        <w:t>We also updated the "Change Password" functionality within the homepage. Previously, there was no verification process, but now the system first verifies the registered email and then asks for the old password before allowing the user to set a new one. Another significant update involved the login system</w:t>
+      </w:r>
+      <w:r>
+        <w:rPr>
+          <w:rFonts w:ascii="Times New Roman" w:hAnsi="Times New Roman" w:cs="Times New Roman"/>
+        </w:rPr>
+        <w:t>,</w:t>
+      </w:r>
+      <w:r>
+        <w:rPr>
+          <w:rFonts w:ascii="Times New Roman" w:hAnsi="Times New Roman" w:cs="Times New Roman"/>
+        </w:rPr>
+        <w:t xml:space="preserve"> </w:t>
+      </w:r>
+      <w:r>
+        <w:rPr>
+          <w:rFonts w:ascii="Times New Roman" w:hAnsi="Times New Roman" w:cs="Times New Roman"/>
+        </w:rPr>
+        <w:t>o</w:t>
+      </w:r>
+      <w:r>
+        <w:rPr>
+          <w:rFonts w:ascii="Times New Roman" w:hAnsi="Times New Roman" w:cs="Times New Roman"/>
+        </w:rPr>
+        <w:t>riginally, users logged in using their email address, but now they use their username, which aligns more closely with standard user expectations and makes the interface more intuitive. These improvements not only enhance user security but also improve cross-team compatibility, especially with the Leaderboard and Matchmaking systems, which rely on user ID and username consistency. Diagrammatically, we revised the login and password reset flows to reflect these new steps, making the logic easier to follow and debug.</w:t>
       </w:r>
     </w:p>
     <w:p>
@@ -676,6 +700,7 @@
   <w:style w:type="character" w:default="1" w:styleId="DefaultParagraphFont">
     <w:name w:val="Default Paragraph Font"/>
     <w:uiPriority w:val="1"/>
+    <w:semiHidden/>
     <w:unhideWhenUsed/>
   </w:style>
   <w:style w:type="table" w:default="1" w:styleId="TableNormal">

</xml_diff>

<commit_message>
Updated authentication team summary of changes.
</commit_message>
<xml_diff>
--- a/iteration3_deliverables/changes_made_documents/Authentication changes summary.docx
+++ b/iteration3_deliverables/changes_made_documents/Authentication changes summary.docx
@@ -1,6 +1,6 @@
 
 <file path=word/document.xml><?xml version="1.0" encoding="utf-8"?>
-<w:document xmlns:wpc="http://schemas.microsoft.com/office/word/2010/wordprocessingCanvas" xmlns:cx="http://schemas.microsoft.com/office/drawing/2014/chartex" xmlns:cx1="http://schemas.microsoft.com/office/drawing/2015/9/8/chartex" xmlns:cx2="http://schemas.microsoft.com/office/drawing/2015/10/21/chartex" xmlns:cx3="http://schemas.microsoft.com/office/drawing/2016/5/9/chartex" xmlns:cx4="http://schemas.microsoft.com/office/drawing/2016/5/10/chartex" xmlns:cx5="http://schemas.microsoft.com/office/drawing/2016/5/11/chartex" xmlns:cx6="http://schemas.microsoft.com/office/drawing/2016/5/12/chartex" xmlns:cx7="http://schemas.microsoft.com/office/drawing/2016/5/13/chartex" xmlns:cx8="http://schemas.microsoft.com/office/drawing/2016/5/14/chartex" xmlns:mc="http://schemas.openxmlformats.org/markup-compatibility/2006" xmlns:aink="http://schemas.microsoft.com/office/drawing/2016/ink" xmlns:am3d="http://schemas.microsoft.com/office/drawing/2017/model3d" xmlns:o="urn:schemas-microsoft-com:office:office" xmlns:oel="http://schemas.microsoft.com/office/2019/extlst" xmlns:r="http://schemas.openxmlformats.org/officeDocument/2006/relationships" xmlns:m="http://schemas.openxmlformats.org/officeDocument/2006/math" xmlns:v="urn:schemas-microsoft-com:vml" xmlns:wp14="http://schemas.microsoft.com/office/word/2010/wordprocessingDrawing" xmlns:wp="http://schemas.openxmlformats.org/drawingml/2006/wordprocessingDrawing" xmlns:w10="urn:schemas-microsoft-com:office:word" xmlns:w="http://schemas.openxmlformats.org/wordprocessingml/2006/main" xmlns:w14="http://schemas.microsoft.com/office/word/2010/wordml" xmlns:w15="http://schemas.microsoft.com/office/word/2012/wordml" xmlns:w16cex="http://schemas.microsoft.com/office/word/2018/wordml/cex" xmlns:w16cid="http://schemas.microsoft.com/office/word/2016/wordml/cid" xmlns:w16="http://schemas.microsoft.com/office/word/2018/wordml" xmlns:w16du="http://schemas.microsoft.com/office/word/2023/wordml/word16du" xmlns:w16sdtdh="http://schemas.microsoft.com/office/word/2020/wordml/sdtdatahash" xmlns:w16se="http://schemas.microsoft.com/office/word/2015/wordml/symex" xmlns:wpg="http://schemas.microsoft.com/office/word/2010/wordprocessingGroup" xmlns:wpi="http://schemas.microsoft.com/office/word/2010/wordprocessingInk" xmlns:wne="http://schemas.microsoft.com/office/word/2006/wordml" xmlns:wps="http://schemas.microsoft.com/office/word/2010/wordprocessingShape" mc:Ignorable="w14 w15 w16se w16cid w16 w16cex w16sdtdh w16du wp14">
+<w:document xmlns:wpc="http://schemas.microsoft.com/office/word/2010/wordprocessingCanvas" xmlns:cx="http://schemas.microsoft.com/office/drawing/2014/chartex" xmlns:cx1="http://schemas.microsoft.com/office/drawing/2015/9/8/chartex" xmlns:cx2="http://schemas.microsoft.com/office/drawing/2015/10/21/chartex" xmlns:cx3="http://schemas.microsoft.com/office/drawing/2016/5/9/chartex" xmlns:cx4="http://schemas.microsoft.com/office/drawing/2016/5/10/chartex" xmlns:cx5="http://schemas.microsoft.com/office/drawing/2016/5/11/chartex" xmlns:cx6="http://schemas.microsoft.com/office/drawing/2016/5/12/chartex" xmlns:cx7="http://schemas.microsoft.com/office/drawing/2016/5/13/chartex" xmlns:cx8="http://schemas.microsoft.com/office/drawing/2016/5/14/chartex" xmlns:mc="http://schemas.openxmlformats.org/markup-compatibility/2006" xmlns:aink="http://schemas.microsoft.com/office/drawing/2016/ink" xmlns:am3d="http://schemas.microsoft.com/office/drawing/2017/model3d" xmlns:o="urn:schemas-microsoft-com:office:office" xmlns:oel="http://schemas.microsoft.com/office/2019/extlst" xmlns:r="http://schemas.openxmlformats.org/officeDocument/2006/relationships" xmlns:m="http://schemas.openxmlformats.org/officeDocument/2006/math" xmlns:v="urn:schemas-microsoft-com:vml" xmlns:wp14="http://schemas.microsoft.com/office/word/2010/wordprocessingDrawing" xmlns:wp="http://schemas.openxmlformats.org/drawingml/2006/wordprocessingDrawing" xmlns:w10="urn:schemas-microsoft-com:office:word" xmlns:w="http://schemas.openxmlformats.org/wordprocessingml/2006/main" xmlns:w14="http://schemas.microsoft.com/office/word/2010/wordml" xmlns:w15="http://schemas.microsoft.com/office/word/2012/wordml" xmlns:w16cex="http://schemas.microsoft.com/office/word/2018/wordml/cex" xmlns:w16cid="http://schemas.microsoft.com/office/word/2016/wordml/cid" xmlns:w16="http://schemas.microsoft.com/office/word/2018/wordml" xmlns:w16du="http://schemas.microsoft.com/office/word/2023/wordml/word16du" xmlns:w16sdtdh="http://schemas.microsoft.com/office/word/2020/wordml/sdtdatahash" xmlns:w16sdtfl="http://schemas.microsoft.com/office/word/2024/wordml/sdtformatlock" xmlns:w16se="http://schemas.microsoft.com/office/word/2015/wordml/symex" xmlns:wpg="http://schemas.microsoft.com/office/word/2010/wordprocessingGroup" xmlns:wpi="http://schemas.microsoft.com/office/word/2010/wordprocessingInk" xmlns:wne="http://schemas.microsoft.com/office/word/2006/wordml" xmlns:wps="http://schemas.microsoft.com/office/word/2010/wordprocessingShape" mc:Ignorable="w14 w15 w16se w16cid w16 w16cex w16sdtdh w16sdtfl w16du wp14">
   <w:body>
     <w:p>
       <w:pPr>
@@ -79,13 +79,201 @@
         </w:rPr>
         <w:t>riginally, users logged in using their email address, but now they use their username, which aligns more closely with standard user expectations and makes the interface more intuitive. These improvements not only enhance user security but also improve cross-team compatibility, especially with the Leaderboard and Matchmaking systems, which rely on user ID and username consistency. Diagrammatically, we revised the login and password reset flows to reflect these new steps, making the logic easier to follow and debug.</w:t>
       </w:r>
-    </w:p>
-    <w:p>
-      <w:pPr>
+      <w:r>
         <w:rPr>
           <w:rFonts w:ascii="Times New Roman" w:hAnsi="Times New Roman" w:cs="Times New Roman"/>
+          <w:noProof/>
         </w:rPr>
-      </w:pPr>
+        <w:drawing>
+          <wp:inline distT="0" distB="0" distL="0" distR="0" wp14:anchorId="29237016" wp14:editId="6745CA47">
+            <wp:extent cx="5943600" cy="1086485"/>
+            <wp:effectExtent l="19050" t="19050" r="19050" b="18415"/>
+            <wp:docPr id="1918653627" name="Picture 1" descr="A close up of a computer&#10;&#10;AI-generated content may be incorrect."/>
+            <wp:cNvGraphicFramePr>
+              <a:graphicFrameLocks xmlns:a="http://schemas.openxmlformats.org/drawingml/2006/main" noChangeAspect="1"/>
+            </wp:cNvGraphicFramePr>
+            <a:graphic xmlns:a="http://schemas.openxmlformats.org/drawingml/2006/main">
+              <a:graphicData uri="http://schemas.openxmlformats.org/drawingml/2006/picture">
+                <pic:pic xmlns:pic="http://schemas.openxmlformats.org/drawingml/2006/picture">
+                  <pic:nvPicPr>
+                    <pic:cNvPr id="1918653627" name="Picture 1" descr="A close up of a computer&#10;&#10;AI-generated content may be incorrect."/>
+                    <pic:cNvPicPr/>
+                  </pic:nvPicPr>
+                  <pic:blipFill>
+                    <a:blip r:embed="rId4">
+                      <a:extLst>
+                        <a:ext uri="{28A0092B-C50C-407E-A947-70E740481C1C}">
+                          <a14:useLocalDpi xmlns:a14="http://schemas.microsoft.com/office/drawing/2010/main" val="0"/>
+                        </a:ext>
+                      </a:extLst>
+                    </a:blip>
+                    <a:stretch>
+                      <a:fillRect/>
+                    </a:stretch>
+                  </pic:blipFill>
+                  <pic:spPr>
+                    <a:xfrm>
+                      <a:off x="0" y="0"/>
+                      <a:ext cx="5943600" cy="1086485"/>
+                    </a:xfrm>
+                    <a:prstGeom prst="rect">
+                      <a:avLst/>
+                    </a:prstGeom>
+                    <a:ln>
+                      <a:solidFill>
+                        <a:schemeClr val="tx1"/>
+                      </a:solidFill>
+                    </a:ln>
+                  </pic:spPr>
+                </pic:pic>
+              </a:graphicData>
+            </a:graphic>
+          </wp:inline>
+        </w:drawing>
+      </w:r>
+      <w:r>
+        <w:rPr>
+          <w:rFonts w:ascii="Times New Roman" w:hAnsi="Times New Roman" w:cs="Times New Roman"/>
+          <w:noProof/>
+        </w:rPr>
+        <w:lastRenderedPageBreak/>
+        <w:drawing>
+          <wp:inline distT="0" distB="0" distL="0" distR="0" wp14:anchorId="6B22CE1A" wp14:editId="38E88860">
+            <wp:extent cx="5943600" cy="2897505"/>
+            <wp:effectExtent l="0" t="0" r="0" b="0"/>
+            <wp:docPr id="1780366089" name="Picture 2" descr="A screenshot of a computer program&#10;&#10;AI-generated content may be incorrect."/>
+            <wp:cNvGraphicFramePr>
+              <a:graphicFrameLocks xmlns:a="http://schemas.openxmlformats.org/drawingml/2006/main" noChangeAspect="1"/>
+            </wp:cNvGraphicFramePr>
+            <a:graphic xmlns:a="http://schemas.openxmlformats.org/drawingml/2006/main">
+              <a:graphicData uri="http://schemas.openxmlformats.org/drawingml/2006/picture">
+                <pic:pic xmlns:pic="http://schemas.openxmlformats.org/drawingml/2006/picture">
+                  <pic:nvPicPr>
+                    <pic:cNvPr id="1780366089" name="Picture 2" descr="A screenshot of a computer program&#10;&#10;AI-generated content may be incorrect."/>
+                    <pic:cNvPicPr/>
+                  </pic:nvPicPr>
+                  <pic:blipFill>
+                    <a:blip r:embed="rId5">
+                      <a:extLst>
+                        <a:ext uri="{28A0092B-C50C-407E-A947-70E740481C1C}">
+                          <a14:useLocalDpi xmlns:a14="http://schemas.microsoft.com/office/drawing/2010/main" val="0"/>
+                        </a:ext>
+                      </a:extLst>
+                    </a:blip>
+                    <a:stretch>
+                      <a:fillRect/>
+                    </a:stretch>
+                  </pic:blipFill>
+                  <pic:spPr>
+                    <a:xfrm>
+                      <a:off x="0" y="0"/>
+                      <a:ext cx="5943600" cy="2897505"/>
+                    </a:xfrm>
+                    <a:prstGeom prst="rect">
+                      <a:avLst/>
+                    </a:prstGeom>
+                  </pic:spPr>
+                </pic:pic>
+              </a:graphicData>
+            </a:graphic>
+          </wp:inline>
+        </w:drawing>
+      </w:r>
+      <w:r>
+        <w:rPr>
+          <w:rFonts w:ascii="Times New Roman" w:hAnsi="Times New Roman" w:cs="Times New Roman"/>
+          <w:noProof/>
+        </w:rPr>
+        <w:drawing>
+          <wp:inline distT="0" distB="0" distL="0" distR="0" wp14:anchorId="2C106F26" wp14:editId="773D9E30">
+            <wp:extent cx="5943600" cy="4474210"/>
+            <wp:effectExtent l="0" t="0" r="0" b="2540"/>
+            <wp:docPr id="1606229071" name="Picture 3" descr="A screenshot of a computer screen&#10;&#10;AI-generated content may be incorrect."/>
+            <wp:cNvGraphicFramePr>
+              <a:graphicFrameLocks xmlns:a="http://schemas.openxmlformats.org/drawingml/2006/main" noChangeAspect="1"/>
+            </wp:cNvGraphicFramePr>
+            <a:graphic xmlns:a="http://schemas.openxmlformats.org/drawingml/2006/main">
+              <a:graphicData uri="http://schemas.openxmlformats.org/drawingml/2006/picture">
+                <pic:pic xmlns:pic="http://schemas.openxmlformats.org/drawingml/2006/picture">
+                  <pic:nvPicPr>
+                    <pic:cNvPr id="1606229071" name="Picture 3" descr="A screenshot of a computer screen&#10;&#10;AI-generated content may be incorrect."/>
+                    <pic:cNvPicPr/>
+                  </pic:nvPicPr>
+                  <pic:blipFill>
+                    <a:blip r:embed="rId6">
+                      <a:extLst>
+                        <a:ext uri="{28A0092B-C50C-407E-A947-70E740481C1C}">
+                          <a14:useLocalDpi xmlns:a14="http://schemas.microsoft.com/office/drawing/2010/main" val="0"/>
+                        </a:ext>
+                      </a:extLst>
+                    </a:blip>
+                    <a:stretch>
+                      <a:fillRect/>
+                    </a:stretch>
+                  </pic:blipFill>
+                  <pic:spPr>
+                    <a:xfrm>
+                      <a:off x="0" y="0"/>
+                      <a:ext cx="5943600" cy="4474210"/>
+                    </a:xfrm>
+                    <a:prstGeom prst="rect">
+                      <a:avLst/>
+                    </a:prstGeom>
+                  </pic:spPr>
+                </pic:pic>
+              </a:graphicData>
+            </a:graphic>
+          </wp:inline>
+        </w:drawing>
+      </w:r>
+      <w:r>
+        <w:rPr>
+          <w:rFonts w:ascii="Times New Roman" w:hAnsi="Times New Roman" w:cs="Times New Roman"/>
+          <w:noProof/>
+        </w:rPr>
+        <w:lastRenderedPageBreak/>
+        <w:drawing>
+          <wp:inline distT="0" distB="0" distL="0" distR="0" wp14:anchorId="759FFEEA" wp14:editId="36737BAB">
+            <wp:extent cx="5943600" cy="6202680"/>
+            <wp:effectExtent l="0" t="0" r="0" b="7620"/>
+            <wp:docPr id="1499874431" name="Picture 4" descr="A screenshot of a login screen&#10;&#10;AI-generated content may be incorrect."/>
+            <wp:cNvGraphicFramePr>
+              <a:graphicFrameLocks xmlns:a="http://schemas.openxmlformats.org/drawingml/2006/main" noChangeAspect="1"/>
+            </wp:cNvGraphicFramePr>
+            <a:graphic xmlns:a="http://schemas.openxmlformats.org/drawingml/2006/main">
+              <a:graphicData uri="http://schemas.openxmlformats.org/drawingml/2006/picture">
+                <pic:pic xmlns:pic="http://schemas.openxmlformats.org/drawingml/2006/picture">
+                  <pic:nvPicPr>
+                    <pic:cNvPr id="1499874431" name="Picture 4" descr="A screenshot of a login screen&#10;&#10;AI-generated content may be incorrect."/>
+                    <pic:cNvPicPr/>
+                  </pic:nvPicPr>
+                  <pic:blipFill>
+                    <a:blip r:embed="rId7">
+                      <a:extLst>
+                        <a:ext uri="{28A0092B-C50C-407E-A947-70E740481C1C}">
+                          <a14:useLocalDpi xmlns:a14="http://schemas.microsoft.com/office/drawing/2010/main" val="0"/>
+                        </a:ext>
+                      </a:extLst>
+                    </a:blip>
+                    <a:stretch>
+                      <a:fillRect/>
+                    </a:stretch>
+                  </pic:blipFill>
+                  <pic:spPr>
+                    <a:xfrm>
+                      <a:off x="0" y="0"/>
+                      <a:ext cx="5943600" cy="6202680"/>
+                    </a:xfrm>
+                    <a:prstGeom prst="rect">
+                      <a:avLst/>
+                    </a:prstGeom>
+                  </pic:spPr>
+                </pic:pic>
+              </a:graphicData>
+            </a:graphic>
+          </wp:inline>
+        </w:drawing>
+      </w:r>
     </w:p>
     <w:sectPr>
       <w:pgSz w:w="12240" w:h="15840"/>
@@ -98,7 +286,7 @@
 </file>
 
 <file path=word/styles.xml><?xml version="1.0" encoding="utf-8"?>
-<w:styles xmlns:mc="http://schemas.openxmlformats.org/markup-compatibility/2006" xmlns:r="http://schemas.openxmlformats.org/officeDocument/2006/relationships" xmlns:w="http://schemas.openxmlformats.org/wordprocessingml/2006/main" xmlns:w14="http://schemas.microsoft.com/office/word/2010/wordml" xmlns:w15="http://schemas.microsoft.com/office/word/2012/wordml" xmlns:w16cex="http://schemas.microsoft.com/office/word/2018/wordml/cex" xmlns:w16cid="http://schemas.microsoft.com/office/word/2016/wordml/cid" xmlns:w16="http://schemas.microsoft.com/office/word/2018/wordml" xmlns:w16du="http://schemas.microsoft.com/office/word/2023/wordml/word16du" xmlns:w16sdtdh="http://schemas.microsoft.com/office/word/2020/wordml/sdtdatahash" xmlns:w16se="http://schemas.microsoft.com/office/word/2015/wordml/symex" mc:Ignorable="w14 w15 w16se w16cid w16 w16cex w16sdtdh w16du">
+<w:styles xmlns:mc="http://schemas.openxmlformats.org/markup-compatibility/2006" xmlns:r="http://schemas.openxmlformats.org/officeDocument/2006/relationships" xmlns:w="http://schemas.openxmlformats.org/wordprocessingml/2006/main" xmlns:w14="http://schemas.microsoft.com/office/word/2010/wordml" xmlns:w15="http://schemas.microsoft.com/office/word/2012/wordml" xmlns:w16cex="http://schemas.microsoft.com/office/word/2018/wordml/cex" xmlns:w16cid="http://schemas.microsoft.com/office/word/2016/wordml/cid" xmlns:w16="http://schemas.microsoft.com/office/word/2018/wordml" xmlns:w16du="http://schemas.microsoft.com/office/word/2023/wordml/word16du" xmlns:w16sdtdh="http://schemas.microsoft.com/office/word/2020/wordml/sdtdatahash" xmlns:w16sdtfl="http://schemas.microsoft.com/office/word/2024/wordml/sdtformatlock" xmlns:w16se="http://schemas.microsoft.com/office/word/2015/wordml/symex" mc:Ignorable="w14 w15 w16se w16cid w16 w16cex w16sdtdh w16sdtfl w16du">
   <w:docDefaults>
     <w:rPrDefault>
       <w:rPr>

</xml_diff>